<commit_message>
accès aux données aux donneurs et visiteurs via chatbot enlevé
</commit_message>
<xml_diff>
--- a/HemoLink-Presentation.docx
+++ b/HemoLink-Presentation.docx
@@ -134,10 +134,7 @@
         <w:t xml:space="preserve">Qui ? </w:t>
       </w:r>
       <w:r>
-        <w:t>Toute personne de 18 à</w:t>
-      </w:r>
-      <w:r>
-        <w:t xml:space="preserve"> 65 ans, ≥ 50 kg, en bonne santé.</w:t>
+        <w:t>Toute personne de 18 à 65 ans, ≥ 50 kg, en bonne santé.</w:t>
       </w:r>
     </w:p>
     <w:p>
@@ -188,10 +185,7 @@
         </w:numPr>
       </w:pPr>
       <w:r>
-        <w:t xml:space="preserve">Voir son tableau de bord : statut d’éligibilité, </w:t>
-      </w:r>
-      <w:r>
-        <w:t>prochaine date de don, nombre de vies sauvées</w:t>
+        <w:t>Voir son tableau de bord : statut d’éligibilité, prochaine date de don, nombre de vies sauvées</w:t>
       </w:r>
     </w:p>
     <w:p>
@@ -239,10 +233,7 @@
         </w:numPr>
       </w:pPr>
       <w:r>
-        <w:t>Éditer so</w:t>
-      </w:r>
-      <w:r>
-        <w:t>n profil : disponibilité, coordonnées, géolocalisation</w:t>
+        <w:t>Éditer son profil : disponibilité, coordonnées, géolocalisation</w:t>
       </w:r>
     </w:p>
     <w:p>
@@ -289,10 +280,7 @@
         <w:t xml:space="preserve">Qui ? </w:t>
       </w:r>
       <w:r>
-        <w:t xml:space="preserve">Le </w:t>
-      </w:r>
-      <w:r>
-        <w:t>personnel d'un hôpital partenaire (CHNU Fann, Hôpital Principal, Dalal Jamm, etc.).</w:t>
+        <w:t>Le personnel d'un hôpital partenaire (CHNU Fann, Hôpital Principal, Dalal Jamm, etc.).</w:t>
       </w:r>
     </w:p>
     <w:p>
@@ -367,10 +355,7 @@
         </w:numPr>
       </w:pPr>
       <w:r>
-        <w:t xml:space="preserve">Suivre les </w:t>
-      </w:r>
-      <w:r>
-        <w:t>réponses des donneurs en temps réel</w:t>
+        <w:t>Suivre les réponses des donneurs en temps réel</w:t>
       </w:r>
     </w:p>
     <w:p>
@@ -456,10 +441,7 @@
         <w:t xml:space="preserve">Rôle ? </w:t>
       </w:r>
       <w:r>
-        <w:t xml:space="preserve">Pilotage </w:t>
-      </w:r>
-      <w:r>
-        <w:t>stratégique, validation, supervision.</w:t>
+        <w:t>Pilotage stratégique, validation, supervision.</w:t>
       </w:r>
     </w:p>
     <w:p>
@@ -507,10 +489,7 @@
         </w:numPr>
       </w:pPr>
       <w:r>
-        <w:t>Statistiques 30 jours : activité, taux de</w:t>
-      </w:r>
-      <w:r>
-        <w:t xml:space="preserve"> résolution, délai moyen de réponse</w:t>
+        <w:t>Statistiques 30 jours : activité, taux de résolution, délai moyen de réponse</w:t>
       </w:r>
     </w:p>
     <w:p>
@@ -558,10 +537,7 @@
         </w:numPr>
       </w:pPr>
       <w:r>
-        <w:t>Audit log : qui a fait quoi quand (confo</w:t>
-      </w:r>
-      <w:r>
-        <w:t>rmité réglementaire)</w:t>
+        <w:t>Audit log : qui a fait quoi quand (conformité réglementaire)</w:t>
       </w:r>
     </w:p>
     <w:p>
@@ -635,10 +611,7 @@
         </w:numPr>
       </w:pPr>
       <w:r>
-        <w:t>Gestion des comptes utilisateurs et désactivatio</w:t>
-      </w:r>
-      <w:r>
-        <w:t>n</w:t>
+        <w:t>Gestion des comptes utilisateurs et désactivation</w:t>
       </w:r>
     </w:p>
     <w:p>
@@ -724,10 +697,7 @@
         </w:numPr>
       </w:pPr>
       <w:r>
-        <w:t>Répondre à des questions en langage naturel sur les données (« combien de O- disponibles à</w:t>
-      </w:r>
-      <w:r>
-        <w:t xml:space="preserve"> Dakar ? »)</w:t>
+        <w:t>Répondre à des questions en langage naturel sur les données (« combien de O- disponibles à Dakar ? »)</w:t>
       </w:r>
     </w:p>
     <w:p>
@@ -739,7 +709,7 @@
         </w:numPr>
       </w:pPr>
       <w:r>
-        <w:t>Reformuler les chiffres bruts en phrases compréhensibles pour le staff médical</w:t>
+        <w:t>Prédire les ruptures de stock : autonomie en jours par hôpital et par groupe, alerte à J-7, notification automatique au staff</w:t>
       </w:r>
     </w:p>
     <w:p>
@@ -751,7 +721,7 @@
         </w:numPr>
       </w:pPr>
       <w:r>
-        <w:t>Conseiller sur l’éligibilité d’un donneur</w:t>
+        <w:t>Recommander les donneurs à mobiliser : score sur 100 explicable (éligibilité, fiabilité, proximité, expérience)</w:t>
       </w:r>
     </w:p>
     <w:p>
@@ -763,7 +733,7 @@
         </w:numPr>
       </w:pPr>
       <w:r>
-        <w:t>Expliquer les règles métier (délais inter-dons, groupes rares, etc.)</w:t>
+        <w:t>Expliquer les règles métier et rappeler automatiquement aux donneurs redevenus éligibles qu’ils peuvent sauver des vies</w:t>
       </w:r>
     </w:p>
     <w:p>
@@ -775,10 +745,7 @@
         </w:numPr>
       </w:pPr>
       <w:r>
-        <w:t>Génère uniquement du SQL en lecture seule, encadré par</w:t>
-      </w:r>
-      <w:r>
-        <w:t xml:space="preserve"> notre garde sqlGuard</w:t>
+        <w:t>Génère uniquement du SQL en lecture seule, encadré par notre garde sqlGuard</w:t>
       </w:r>
     </w:p>
     <w:p>
@@ -816,10 +783,7 @@
         <w:t>6 minutes pile</w:t>
       </w:r>
       <w:r>
-        <w:t>. Chaque bloc fait ~140-150 mots (rythme normal en français). Les indications scéniques entre crochets ne sont P</w:t>
-      </w:r>
-      <w:r>
-        <w:t>AS prononcées. Les mots en gras sont à appuyer fortement.</w:t>
+        <w:t>. Chaque bloc fait ~140-150 mots (rythme normal en français). Les indications scéniques entre crochets ne sont PAS prononcées. Les mots en gras sont à appuyer fortement.</w:t>
       </w:r>
     </w:p>
     <w:tbl>
@@ -888,17 +852,7 @@
                 <w:sz w:val="20"/>
                 <w:szCs w:val="20"/>
               </w:rPr>
-              <w:t>Pour les interventions 4, 5 et 6 (parties démo), nous projetons des SCREENSHOTS de l’application au lieu de cliquer en direct. Cela évite tout risque technique (r</w:t>
-            </w:r>
-            <w:r>
-              <w:rPr>
-                <w:i/>
-                <w:iCs/>
-                <w:color w:val="4A4A4A"/>
-                <w:sz w:val="20"/>
-                <w:szCs w:val="20"/>
-              </w:rPr>
-              <w:t>éseau, MySQL non démarré, latence) et garantit que les 6 minutes seront tenues exactement.</w:t>
+              <w:t>Pour les interventions 4, 5 et 6 (parties démo), nous projetons des SCREENSHOTS de l’application au lieu de cliquer en direct. Cela évite tout risque technique (réseau, MySQL non démarré, latence) et garantit que les 6 minutes seront tenues exactement.</w:t>
             </w:r>
           </w:p>
         </w:tc>
@@ -914,10 +868,7 @@
         <w:pStyle w:val="Titre3"/>
       </w:pPr>
       <w:r>
-        <w:t>🎤</w:t>
-      </w:r>
-      <w:r>
-        <w:t xml:space="preserve"> Intervenant 1 — Du diagnostic à la solution (1 min)</w:t>
+        <w:t>🎤 Intervenant 1 — Du diagnostic à la solution (1 min)</w:t>
       </w:r>
     </w:p>
     <w:tbl>
@@ -987,39 +938,7 @@
                 <w:iCs/>
                 <w:color w:val="4A4A4A"/>
               </w:rPr>
-              <w:t>« Il y a quelques semaines, devant ce</w:t>
-            </w:r>
-            <w:r>
-              <w:rPr>
-                <w:i/>
-                <w:iCs/>
-                <w:color w:val="4A4A4A"/>
-              </w:rPr>
-              <w:t>tte</w:t>
-            </w:r>
-            <w:r>
-              <w:rPr>
-                <w:i/>
-                <w:iCs/>
-                <w:color w:val="4A4A4A"/>
-              </w:rPr>
-              <w:t xml:space="preserve"> même </w:t>
-            </w:r>
-            <w:r>
-              <w:rPr>
-                <w:i/>
-                <w:iCs/>
-                <w:color w:val="4A4A4A"/>
-              </w:rPr>
-              <w:t>audience</w:t>
-            </w:r>
-            <w:r>
-              <w:rPr>
-                <w:i/>
-                <w:iCs/>
-                <w:color w:val="4A4A4A"/>
-              </w:rPr>
-              <w:t xml:space="preserve">, nous vous posions un problème : </w:t>
+              <w:t xml:space="preserve">« Il y a quelques semaines, devant cette même audience, nous vous posions un problème : </w:t>
             </w:r>
           </w:p>
           <w:p>
@@ -1074,7 +993,71 @@
                 <w:bCs/>
                 <w:color w:val="990011"/>
               </w:rPr>
-              <w:t xml:space="preserve">Elle est testable </w:t>
+              <w:t>Elle est testable maintenant</w:t>
+            </w:r>
+            <w:r>
+              <w:rPr>
+                <w:i/>
+                <w:iCs/>
+                <w:color w:val="4A4A4A"/>
+              </w:rPr>
+              <w:t xml:space="preserve"> avec des comptes de démonstration pour les donneurs, les hôpitaux et le CNTS.</w:t>
+            </w:r>
+          </w:p>
+          <w:p>
+            <w:pPr>
+              <w:spacing w:after="60"/>
+            </w:pPr>
+            <w:r>
+              <w:rPr>
+                <w:i/>
+                <w:iCs/>
+                <w:color w:val="4A4A4A"/>
+              </w:rPr>
+              <w:t>En 6 minutes, nous allons vous présenter trois choses :</w:t>
+            </w:r>
+          </w:p>
+          <w:p>
+            <w:r>
+              <w:rPr>
+                <w:i/>
+                <w:iCs/>
+                <w:color w:val="4A4A4A"/>
+              </w:rPr>
+              <w:t>— comment nous avons conçu la plateforme (modèles, cas d’utilisation),</w:t>
+            </w:r>
+          </w:p>
+          <w:p>
+            <w:r>
+              <w:rPr>
+                <w:i/>
+                <w:iCs/>
+                <w:color w:val="4A4A4A"/>
+              </w:rPr>
+              <w:t>— comment elle fonctionne au quotidien (démo via captures),</w:t>
+            </w:r>
+          </w:p>
+          <w:p>
+            <w:pPr>
+              <w:spacing w:after="120"/>
+            </w:pPr>
+            <w:r>
+              <w:rPr>
+                <w:i/>
+                <w:iCs/>
+                <w:color w:val="4A4A4A"/>
+              </w:rPr>
+              <w:t>— et où nous voulons aller demain.</w:t>
+            </w:r>
+          </w:p>
+          <w:p>
+            <w:r>
+              <w:rPr>
+                <w:i/>
+                <w:iCs/>
+                <w:color w:val="4A4A4A"/>
+              </w:rPr>
+              <w:t xml:space="preserve">Notre objectif tient en une phrase : </w:t>
             </w:r>
             <w:r>
               <w:rPr>
@@ -1082,86 +1065,6 @@
                 <w:bCs/>
                 <w:color w:val="990011"/>
               </w:rPr>
-              <w:t>maintenant</w:t>
-            </w:r>
-            <w:r>
-              <w:rPr>
-                <w:i/>
-                <w:iCs/>
-                <w:color w:val="4A4A4A"/>
-              </w:rPr>
-              <w:t xml:space="preserve"> avec des comptes de démonstration pour les donneurs, les hôpitaux et le CNTS.</w:t>
-            </w:r>
-          </w:p>
-          <w:p>
-            <w:pPr>
-              <w:spacing w:after="60"/>
-            </w:pPr>
-            <w:r>
-              <w:rPr>
-                <w:i/>
-                <w:iCs/>
-                <w:color w:val="4A4A4A"/>
-              </w:rPr>
-              <w:t>En 6 minutes, nous allons vous présenter trois choses :</w:t>
-            </w:r>
-          </w:p>
-          <w:p>
-            <w:r>
-              <w:rPr>
-                <w:i/>
-                <w:iCs/>
-                <w:color w:val="4A4A4A"/>
-              </w:rPr>
-              <w:t>— comment nous avons conçu la plateforme (modèles, cas d’utilisation),</w:t>
-            </w:r>
-          </w:p>
-          <w:p>
-            <w:r>
-              <w:rPr>
-                <w:i/>
-                <w:iCs/>
-                <w:color w:val="4A4A4A"/>
-              </w:rPr>
-              <w:t>— comment elle fonctionne au quotidien (</w:t>
-            </w:r>
-            <w:r>
-              <w:rPr>
-                <w:i/>
-                <w:iCs/>
-                <w:color w:val="4A4A4A"/>
-              </w:rPr>
-              <w:t>démo via captures),</w:t>
-            </w:r>
-          </w:p>
-          <w:p>
-            <w:pPr>
-              <w:spacing w:after="120"/>
-            </w:pPr>
-            <w:r>
-              <w:rPr>
-                <w:i/>
-                <w:iCs/>
-                <w:color w:val="4A4A4A"/>
-              </w:rPr>
-              <w:t>— et où nous voulons aller demain.</w:t>
-            </w:r>
-          </w:p>
-          <w:p>
-            <w:r>
-              <w:rPr>
-                <w:i/>
-                <w:iCs/>
-                <w:color w:val="4A4A4A"/>
-              </w:rPr>
-              <w:t xml:space="preserve">Notre objectif tient en une phrase : </w:t>
-            </w:r>
-            <w:r>
-              <w:rPr>
-                <w:b/>
-                <w:bCs/>
-                <w:color w:val="990011"/>
-              </w:rPr>
               <w:t>que le CNTS adopte HemoLink, et que d’autres pays s’en inspirent.</w:t>
             </w:r>
             <w:r>
@@ -1186,10 +1089,7 @@
         <w:pStyle w:val="Titre3"/>
       </w:pPr>
       <w:r>
-        <w:t>🎤</w:t>
-      </w:r>
-      <w:r>
-        <w:t xml:space="preserve"> Intervenant 2 — La vision, les acteurs (1 min)</w:t>
+        <w:t>🎤 Intervenant 2 — La vision, les acteurs (1 min)</w:t>
       </w:r>
     </w:p>
     <w:tbl>
@@ -1304,15 +1204,7 @@
                 <w:iCs/>
                 <w:color w:val="4A4A4A"/>
               </w:rPr>
-              <w:t xml:space="preserve"> s’inscrit en ligne, déclare son groupe </w:t>
-            </w:r>
-            <w:r>
-              <w:rPr>
-                <w:i/>
-                <w:iCs/>
-                <w:color w:val="4A4A4A"/>
-              </w:rPr>
-              <w:t>sanguin et sa géolocalisation. Il reçoit des alertes UNIQUEMENT pour les urgences proches de chez lui et compatibles avec son groupe. Il accepte ou refuse en un clic.</w:t>
+              <w:t xml:space="preserve"> s’inscrit en ligne, déclare son groupe sanguin et sa géolocalisation. Il reçoit des alertes UNIQUEMENT pour les urgences proches de chez lui et compatibles avec son groupe. Il accepte ou refuse en un clic.</w:t>
             </w:r>
           </w:p>
           <w:p>
@@ -1341,15 +1233,7 @@
                 <w:iCs/>
                 <w:color w:val="4A4A4A"/>
               </w:rPr>
-              <w:t xml:space="preserve"> gère ses stocks en temps réel. Quand il est en rupture, il déclenche une alerte</w:t>
-            </w:r>
-            <w:r>
-              <w:rPr>
-                <w:i/>
-                <w:iCs/>
-                <w:color w:val="4A4A4A"/>
-              </w:rPr>
-              <w:t xml:space="preserve"> : groupe, rayon, niveau d’urgence. En moins d’une seconde, HemoLink identifie </w:t>
+              <w:t xml:space="preserve"> gère ses stocks en temps réel. Quand il est en rupture, il déclenche une alerte : groupe, rayon, niveau d’urgence. En moins d’une seconde, HemoLink identifie </w:t>
             </w:r>
             <w:r>
               <w:rPr>
@@ -1394,15 +1278,7 @@
                 <w:iCs/>
                 <w:color w:val="4A4A4A"/>
               </w:rPr>
-              <w:t xml:space="preserve"> dispose d’une vue d’ensemble : stocks nationaux, donneurs par région, activité</w:t>
-            </w:r>
-            <w:r>
-              <w:rPr>
-                <w:i/>
-                <w:iCs/>
-                <w:color w:val="4A4A4A"/>
-              </w:rPr>
-              <w:t xml:space="preserve"> en temps réel. C’est leur cockpit de pilotage stratégique.</w:t>
+              <w:t xml:space="preserve"> dispose d’une vue d’ensemble : stocks nationaux, donneurs par région, activité en temps réel. C’est leur cockpit de pilotage stratégique.</w:t>
             </w:r>
           </w:p>
           <w:p>
@@ -1428,10 +1304,7 @@
         <w:pStyle w:val="Titre3"/>
       </w:pPr>
       <w:r>
-        <w:t>🎤</w:t>
-      </w:r>
-      <w:r>
-        <w:t xml:space="preserve"> Intervenant 3 — La conception : MCD, MLD, cas d’utilisation (1 min)</w:t>
+        <w:t>🎤 Intervenant 3 — La conception : MCD, MLD, cas d’utilisation (1 min)</w:t>
       </w:r>
     </w:p>
     <w:tbl>
@@ -1517,15 +1390,7 @@
                 <w:iCs/>
                 <w:color w:val="4A4A4A"/>
               </w:rPr>
-              <w:t xml:space="preserve"> : la rigueur d’un système médical, avec l’agilité d’itéra</w:t>
-            </w:r>
-            <w:r>
-              <w:rPr>
-                <w:i/>
-                <w:iCs/>
-                <w:color w:val="4A4A4A"/>
-              </w:rPr>
-              <w:t>tions Scrum à l’intérieur de chaque phase.</w:t>
+              <w:t xml:space="preserve"> : la rigueur d’un système médical, avec l’agilité d’itérations Scrum à l’intérieur de chaque phase.</w:t>
             </w:r>
           </w:p>
           <w:p>
@@ -1546,23 +1411,15 @@
                 <w:bCs/>
                 <w:color w:val="1E2761"/>
               </w:rPr>
-              <w:t>9 entités</w:t>
-            </w:r>
-            <w:r>
-              <w:rPr>
-                <w:i/>
-                <w:iCs/>
-                <w:color w:val="4A4A4A"/>
-              </w:rPr>
-              <w:t>. Au centre, les alertes lient un hôpital à des donneurs via la table « réponses_alertes », qui joue le rôle de table de notification. Chaqu</w:t>
-            </w:r>
-            <w:r>
-              <w:rPr>
-                <w:i/>
-                <w:iCs/>
-                <w:color w:val="4A4A4A"/>
-              </w:rPr>
-              <w:t>e donneur a son historique, chaque action sensible est tracée dans un journal d’audit — exigence forte du CNTS pour la conformité.</w:t>
+              <w:t>11 entités</w:t>
+            </w:r>
+            <w:r>
+              <w:rPr>
+                <w:i/>
+                <w:iCs/>
+                <w:color w:val="4A4A4A"/>
+              </w:rPr>
+              <w:t>. Au centre, les alertes lient un hôpital à des donneurs via les réponses et des notifications typées (alerte urgente, don réussi, rappel). Chaque donneur a son historique, chaque action sensible est tracée dans un journal d’audit — exigence forte du CNTS — et 61 tests automatisés valident chaque endpoint.</w:t>
             </w:r>
           </w:p>
           <w:p>
@@ -1591,15 +1448,7 @@
                 <w:iCs/>
                 <w:color w:val="4A4A4A"/>
               </w:rPr>
-              <w:t>, on identifie 4 acteurs avec des parcours distincts : le donneur s’inscrit et répond aux alertes ; l’h</w:t>
-            </w:r>
-            <w:r>
-              <w:rPr>
-                <w:i/>
-                <w:iCs/>
-                <w:color w:val="4A4A4A"/>
-              </w:rPr>
-              <w:t>ôpital gère ses stocks et déclenche les alertes ; le CNTS valide les comptes et supervise ; l’admin maintient le système.</w:t>
+              <w:t>, on identifie 4 acteurs avec des parcours distincts : le donneur s’inscrit et répond aux alertes ; l’hôpital gère ses stocks et déclenche les alertes ; le CNTS valide les comptes et supervise ; l’admin maintient le système.</w:t>
             </w:r>
           </w:p>
           <w:p>
@@ -1617,15 +1466,7 @@
                 <w:bCs/>
                 <w:color w:val="1E2761"/>
               </w:rPr>
-              <w:t>Tout</w:t>
-            </w:r>
-            <w:r>
-              <w:rPr>
-                <w:b/>
-                <w:bCs/>
-                <w:color w:val="1E2761"/>
-              </w:rPr>
-              <w:t xml:space="preserve"> est prêt pour passer à l’échelle nationale. </w:t>
+              <w:t xml:space="preserve">Tout est prêt pour passer à l’échelle nationale. </w:t>
             </w:r>
             <w:r>
               <w:rPr>
@@ -1649,10 +1490,7 @@
         <w:pStyle w:val="Titre3"/>
       </w:pPr>
       <w:r>
-        <w:t>🎤</w:t>
-      </w:r>
-      <w:r>
-        <w:t xml:space="preserve"> Intervenant 4 — Démo (par captures) : parcours hôpital + donneur (1 min)</w:t>
+        <w:t>🎤 Intervenant 4 — Démo (par captures) : parcours hôpital + donneur (1 min)</w:t>
       </w:r>
     </w:p>
     <w:tbl>
@@ -1751,15 +1589,7 @@
                 <w:iCs/>
                 <w:color w:val="4A4A4A"/>
               </w:rPr>
-              <w:t xml:space="preserve">Sur cette capture, le formulaire d’alerte : groupe O-, niveau critique, rayon 25 km, 3 </w:t>
-            </w:r>
-            <w:r>
-              <w:rPr>
-                <w:i/>
-                <w:iCs/>
-                <w:color w:val="4A4A4A"/>
-              </w:rPr>
-              <w:t>poches. Validation.</w:t>
+              <w:t>Sur cette capture, le formulaire d’alerte : groupe O-, niveau critique, rayon 25 km, 3 poches. Validation.</w:t>
             </w:r>
           </w:p>
           <w:p>
@@ -1785,15 +1615,7 @@
                 <w:iCs/>
                 <w:color w:val="4A4A4A"/>
               </w:rPr>
-              <w:t>Sur cette capture, l’espace d’Aminata Diop, donneus</w:t>
-            </w:r>
-            <w:r>
-              <w:rPr>
-                <w:i/>
-                <w:iCs/>
-                <w:color w:val="4A4A4A"/>
-              </w:rPr>
-              <w:t>e O-. Bandeau rouge immédiat. Elle voit l’alerte, la distance — 2,4 km — le message du médecin.</w:t>
+              <w:t>Sur cette capture, l’espace d’Aminata Diop, donneuse O-. Bandeau rouge immédiat. Elle voit l’alerte, la distance — 2,4 km — le message du médecin.</w:t>
             </w:r>
             <w:r>
               <w:rPr>
@@ -1835,10 +1657,7 @@
         <w:pStyle w:val="Titre3"/>
       </w:pPr>
       <w:r>
-        <w:t>🎤</w:t>
-      </w:r>
-      <w:r>
-        <w:t xml:space="preserve"> Intervenant 5 — Démo (par captures) : Vue CNTS + Assistant IA (1 min)</w:t>
+        <w:t>🎤 Intervenant 5 — Démo (par captures) : Vue CNTS + Assistant IA (1 min)</w:t>
       </w:r>
     </w:p>
     <w:tbl>
@@ -1924,15 +1743,7 @@
                 <w:iCs/>
                 <w:color w:val="4A4A4A"/>
               </w:rPr>
-              <w:t>. En un coup d’œil : stock</w:t>
-            </w:r>
-            <w:r>
-              <w:rPr>
-                <w:i/>
-                <w:iCs/>
-                <w:color w:val="4A4A4A"/>
-              </w:rPr>
-              <w:t xml:space="preserve">s agrégés du Sénégal entier, groupes critiques en rouge, répartition des donneurs sur les 14 régions, activité des 30 derniers jours. </w:t>
+              <w:t xml:space="preserve">. En un coup d’œil : stocks agrégés du Sénégal entier, groupes critiques en rouge, répartition des donneurs sur les 14 régions, activité des 30 derniers jours. </w:t>
             </w:r>
             <w:r>
               <w:rPr>
@@ -1961,7 +1772,46 @@
                 <w:bCs/>
                 <w:color w:val="1E2761"/>
               </w:rPr>
-              <w:t>assistant IA conver</w:t>
+              <w:t>assistant IA conversationnel</w:t>
+            </w:r>
+            <w:r>
+              <w:rPr>
+                <w:i/>
+                <w:iCs/>
+                <w:color w:val="4A4A4A"/>
+              </w:rPr>
+              <w:t xml:space="preserve"> basé sur Llama 3.3 70B via Groq.</w:t>
+            </w:r>
+          </w:p>
+          <w:p>
+            <w:pPr>
+              <w:spacing w:after="120"/>
+            </w:pPr>
+            <w:r>
+              <w:rPr>
+                <w:i/>
+                <w:iCs/>
+                <w:color w:val="4A4A4A"/>
+              </w:rPr>
+              <w:t xml:space="preserve">Sur cette capture, on tape : « Combien de donneurs O- disponibles à Dakar ? ». L’IA génère une requête SQL en lecture seule — sécurisée par notre garde maison qui n’autorise QUE les SELECT — exécute, et reformule la réponse en français naturel. </w:t>
+            </w:r>
+            <w:r>
+              <w:rPr>
+                <w:b/>
+                <w:bCs/>
+                <w:color w:val="990011"/>
+              </w:rPr>
+              <w:t>Pas de jargon, pas de tableaux bruts, juste une phrase.</w:t>
+            </w:r>
+          </w:p>
+          <w:p>
+            <w:r>
+              <w:rPr>
+                <w:i/>
+                <w:iCs/>
+                <w:color w:val="4A4A4A"/>
+              </w:rPr>
+              <w:t xml:space="preserve">Et au-delà du chat, HemoLink prédit les ruptures de stock — alerte à J-7 — et recommande quels donneurs mobiliser en premier, avec un score explicable. </w:t>
             </w:r>
             <w:r>
               <w:rPr>
@@ -1969,61 +1819,6 @@
                 <w:bCs/>
                 <w:color w:val="1E2761"/>
               </w:rPr>
-              <w:t>sationnel</w:t>
-            </w:r>
-            <w:r>
-              <w:rPr>
-                <w:i/>
-                <w:iCs/>
-                <w:color w:val="4A4A4A"/>
-              </w:rPr>
-              <w:t xml:space="preserve"> basé sur Llama 3.3 70B via Groq.</w:t>
-            </w:r>
-          </w:p>
-          <w:p>
-            <w:pPr>
-              <w:spacing w:after="120"/>
-            </w:pPr>
-            <w:r>
-              <w:rPr>
-                <w:i/>
-                <w:iCs/>
-                <w:color w:val="4A4A4A"/>
-              </w:rPr>
-              <w:t xml:space="preserve">Sur cette capture, on tape : « Combien de donneurs O- disponibles à Dakar ? ». L’IA génère une requête SQL en lecture seule — sécurisée par notre garde maison qui n’autorise QUE les SELECT — exécute, et reformule </w:t>
-            </w:r>
-            <w:r>
-              <w:rPr>
-                <w:i/>
-                <w:iCs/>
-                <w:color w:val="4A4A4A"/>
-              </w:rPr>
-              <w:t xml:space="preserve">la réponse en français naturel. </w:t>
-            </w:r>
-            <w:r>
-              <w:rPr>
-                <w:b/>
-                <w:bCs/>
-                <w:color w:val="990011"/>
-              </w:rPr>
-              <w:t>Pas de jargon, pas de tableaux bruts, juste une phrase.</w:t>
-            </w:r>
-          </w:p>
-          <w:p>
-            <w:r>
-              <w:rPr>
-                <w:i/>
-                <w:iCs/>
-                <w:color w:val="4A4A4A"/>
-              </w:rPr>
-              <w:t xml:space="preserve">Le médecin n’a plus besoin de connaître SQL ni de cliquer dans 5 menus. Il pose sa question, il a sa réponse. </w:t>
-            </w:r>
-            <w:r>
-              <w:rPr>
-                <w:b/>
-                <w:bCs/>
-                <w:color w:val="1E2761"/>
-              </w:rPr>
               <w:t>Voilà notre vision : la donnée médicale accessible à tous. »</w:t>
             </w:r>
           </w:p>
@@ -2040,10 +1835,7 @@
         <w:pStyle w:val="Titre3"/>
       </w:pPr>
       <w:r>
-        <w:t>🎤</w:t>
-      </w:r>
-      <w:r>
-        <w:t xml:space="preserve"> Intervenant 6 — Roadmap + conclusion percutante (1 min)</w:t>
+        <w:t>🎤 Intervenant 6 — Roadmap + conclusion percutante (1 min)</w:t>
       </w:r>
     </w:p>
     <w:tbl>
@@ -2100,7 +1892,41 @@
                 <w:bCs/>
                 <w:color w:val="990011"/>
               </w:rPr>
-              <w:t>Posture : droite, regard</w:t>
+              <w:t>Posture : droite, regard sur le jury, ton solennel sur la dernière phrase</w:t>
+            </w:r>
+          </w:p>
+          <w:p>
+            <w:pPr>
+              <w:spacing w:after="120"/>
+            </w:pPr>
+            <w:r>
+              <w:rPr>
+                <w:i/>
+                <w:iCs/>
+                <w:color w:val="4A4A4A"/>
+              </w:rPr>
+              <w:t xml:space="preserve">« Ce que vous venez de voir fonctionne aujourd’hui. Mais HemoLink, c’est aussi une vision. </w:t>
+            </w:r>
+            <w:r>
+              <w:rPr>
+                <w:b/>
+                <w:bCs/>
+                <w:color w:val="1E2761"/>
+              </w:rPr>
+              <w:t>Quatre chantiers majeurs sont en cours :</w:t>
+            </w:r>
+          </w:p>
+          <w:p>
+            <w:pPr>
+              <w:spacing w:after="120"/>
+            </w:pPr>
+            <w:r>
+              <w:rPr>
+                <w:i/>
+                <w:iCs/>
+                <w:color w:val="4A4A4A"/>
+              </w:rPr>
+              <w:t xml:space="preserve">Un — </w:t>
             </w:r>
             <w:r>
               <w:rPr>
@@ -2108,7 +1934,31 @@
                 <w:bCs/>
                 <w:color w:val="990011"/>
               </w:rPr>
-              <w:t xml:space="preserve"> sur le jury, ton solennel sur la dernière phrase</w:t>
+              <w:t>l’intelligence prédictive</w:t>
+            </w:r>
+            <w:r>
+              <w:rPr>
+                <w:i/>
+                <w:iCs/>
+                <w:color w:val="4A4A4A"/>
+              </w:rPr>
+              <w:t xml:space="preserve"> — elle est déjà livrée : ruptures anticipées à J-7, donneurs classés par score sur 100, rappels automatiques d’éligibilité. Prochaine étape : l’affiner avec les données réelles du terrain. Le système ne réagit plus aux urgences, </w:t>
+            </w:r>
+            <w:r>
+              <w:rPr>
+                <w:b/>
+                <w:bCs/>
+                <w:color w:val="1E2761"/>
+              </w:rPr>
+              <w:t>il les prévient</w:t>
+            </w:r>
+            <w:r>
+              <w:rPr>
+                <w:i/>
+                <w:iCs/>
+                <w:color w:val="4A4A4A"/>
+              </w:rPr>
+              <w:t>.</w:t>
             </w:r>
           </w:p>
           <w:p>
@@ -2121,7 +1971,52 @@
                 <w:iCs/>
                 <w:color w:val="4A4A4A"/>
               </w:rPr>
-              <w:t xml:space="preserve">« Ce que vous venez de voir fonctionne aujourd’hui. Mais HemoLink, c’est aussi une vision. </w:t>
+              <w:t xml:space="preserve">Deux — </w:t>
+            </w:r>
+            <w:r>
+              <w:rPr>
+                <w:b/>
+                <w:bCs/>
+                <w:color w:val="990011"/>
+              </w:rPr>
+              <w:t>la géolocalisation temps réel</w:t>
+            </w:r>
+            <w:r>
+              <w:rPr>
+                <w:i/>
+                <w:iCs/>
+                <w:color w:val="4A4A4A"/>
+              </w:rPr>
+              <w:t>. Avec l’accord du donneur, sa position actuelle remplacera son adresse fixe. Un médecin disponible à 500 mètres d’un hôpital sera contacté en priorité, même s’il habite à 30 km.</w:t>
+            </w:r>
+          </w:p>
+          <w:p>
+            <w:pPr>
+              <w:spacing w:after="120"/>
+            </w:pPr>
+            <w:r>
+              <w:rPr>
+                <w:i/>
+                <w:iCs/>
+                <w:color w:val="4A4A4A"/>
+              </w:rPr>
+              <w:t xml:space="preserve">Trois — </w:t>
+            </w:r>
+            <w:r>
+              <w:rPr>
+                <w:b/>
+                <w:bCs/>
+                <w:color w:val="990011"/>
+              </w:rPr>
+              <w:t>les notifications SMS</w:t>
+            </w:r>
+            <w:r>
+              <w:rPr>
+                <w:i/>
+                <w:iCs/>
+                <w:color w:val="4A4A4A"/>
+              </w:rPr>
+              <w:t xml:space="preserve"> via l’API Sonatel/Orange Sénégal. Aujourd’hui, la notification arrive dans l’application : demain, </w:t>
             </w:r>
             <w:r>
               <w:rPr>
@@ -2129,7 +2024,15 @@
                 <w:bCs/>
                 <w:color w:val="1E2761"/>
               </w:rPr>
-              <w:t>Quatre chantiers majeurs sont en cours :</w:t>
+              <w:t>chaque donneur recevra un SMS court avec le groupe, l’hôpital et un lien de réponse</w:t>
+            </w:r>
+            <w:r>
+              <w:rPr>
+                <w:i/>
+                <w:iCs/>
+                <w:color w:val="4A4A4A"/>
+              </w:rPr>
+              <w:t xml:space="preserve"> — même sans smartphone, même sans data. C’est essentiel pour atteindre les zones rurales.</w:t>
             </w:r>
           </w:p>
           <w:p>
@@ -2142,7 +2045,7 @@
                 <w:iCs/>
                 <w:color w:val="4A4A4A"/>
               </w:rPr>
-              <w:t xml:space="preserve">Un — </w:t>
+              <w:t xml:space="preserve">Quatre — </w:t>
             </w:r>
             <w:r>
               <w:rPr>
@@ -2150,149 +2053,6 @@
                 <w:bCs/>
                 <w:color w:val="990011"/>
               </w:rPr>
-              <w:t>l’intelligence prédictive</w:t>
-            </w:r>
-            <w:r>
-              <w:rPr>
-                <w:i/>
-                <w:iCs/>
-                <w:color w:val="4A4A4A"/>
-              </w:rPr>
-              <w:t xml:space="preserve">. Au-delà du chat, nous allons entraîner un </w:t>
-            </w:r>
-            <w:r>
-              <w:rPr>
-                <w:i/>
-                <w:iCs/>
-                <w:color w:val="4A4A4A"/>
-              </w:rPr>
-              <w:t xml:space="preserve">modèle qui anticipe les ruptures de stock 7 jours à l’avance, recommande les meilleurs donneurs à mobiliser, et optimise les campagnes de don. Le système ne réagira plus aux urgences, </w:t>
-            </w:r>
-            <w:r>
-              <w:rPr>
-                <w:b/>
-                <w:bCs/>
-                <w:color w:val="1E2761"/>
-              </w:rPr>
-              <w:t>il les préviendra</w:t>
-            </w:r>
-            <w:r>
-              <w:rPr>
-                <w:i/>
-                <w:iCs/>
-                <w:color w:val="4A4A4A"/>
-              </w:rPr>
-              <w:t>.</w:t>
-            </w:r>
-          </w:p>
-          <w:p>
-            <w:pPr>
-              <w:spacing w:after="120"/>
-            </w:pPr>
-            <w:r>
-              <w:rPr>
-                <w:i/>
-                <w:iCs/>
-                <w:color w:val="4A4A4A"/>
-              </w:rPr>
-              <w:t xml:space="preserve">Deux — </w:t>
-            </w:r>
-            <w:r>
-              <w:rPr>
-                <w:b/>
-                <w:bCs/>
-                <w:color w:val="990011"/>
-              </w:rPr>
-              <w:t>la géolocalisation temps réel</w:t>
-            </w:r>
-            <w:r>
-              <w:rPr>
-                <w:i/>
-                <w:iCs/>
-                <w:color w:val="4A4A4A"/>
-              </w:rPr>
-              <w:t>. Avec l’accord d</w:t>
-            </w:r>
-            <w:r>
-              <w:rPr>
-                <w:i/>
-                <w:iCs/>
-                <w:color w:val="4A4A4A"/>
-              </w:rPr>
-              <w:t>u donneur, sa position actuelle remplacera son adresse fixe. Un médecin disponible à 500 mètres d’un hôpital sera contacté en priorité, même s’il habite à 30 km.</w:t>
-            </w:r>
-          </w:p>
-          <w:p>
-            <w:pPr>
-              <w:spacing w:after="120"/>
-            </w:pPr>
-            <w:r>
-              <w:rPr>
-                <w:i/>
-                <w:iCs/>
-                <w:color w:val="4A4A4A"/>
-              </w:rPr>
-              <w:t xml:space="preserve">Trois — </w:t>
-            </w:r>
-            <w:r>
-              <w:rPr>
-                <w:b/>
-                <w:bCs/>
-                <w:color w:val="990011"/>
-              </w:rPr>
-              <w:t>les notifications SMS</w:t>
-            </w:r>
-            <w:r>
-              <w:rPr>
-                <w:i/>
-                <w:iCs/>
-                <w:color w:val="4A4A4A"/>
-              </w:rPr>
-              <w:t xml:space="preserve"> via l’API Sonatel/Orange Sénégal. Aujourd’hui, la notification a</w:t>
-            </w:r>
-            <w:r>
-              <w:rPr>
-                <w:i/>
-                <w:iCs/>
-                <w:color w:val="4A4A4A"/>
-              </w:rPr>
-              <w:t xml:space="preserve">rrive dans l’application : demain, </w:t>
-            </w:r>
-            <w:r>
-              <w:rPr>
-                <w:b/>
-                <w:bCs/>
-                <w:color w:val="1E2761"/>
-              </w:rPr>
-              <w:t>chaque donneur recevra un SMS court avec le groupe, l’hôpital et un lien de réponse</w:t>
-            </w:r>
-            <w:r>
-              <w:rPr>
-                <w:i/>
-                <w:iCs/>
-                <w:color w:val="4A4A4A"/>
-              </w:rPr>
-              <w:t xml:space="preserve"> — même sans smartphone, même sans data. C’est essentiel pour atteindre les zones rurales.</w:t>
-            </w:r>
-          </w:p>
-          <w:p>
-            <w:pPr>
-              <w:spacing w:after="120"/>
-            </w:pPr>
-            <w:r>
-              <w:rPr>
-                <w:i/>
-                <w:iCs/>
-                <w:color w:val="4A4A4A"/>
-              </w:rPr>
-              <w:t xml:space="preserve">Quatre — </w:t>
-            </w:r>
-            <w:r>
-              <w:rPr>
-                <w:b/>
-                <w:bCs/>
-                <w:color w:val="990011"/>
-              </w:rPr>
               <w:t>la plateforme en wolof</w:t>
             </w:r>
             <w:r>
@@ -2301,15 +2061,7 @@
                 <w:iCs/>
                 <w:color w:val="4A4A4A"/>
               </w:rPr>
-              <w:t xml:space="preserve">. Pour qu’aucun </w:t>
-            </w:r>
-            <w:r>
-              <w:rPr>
-                <w:i/>
-                <w:iCs/>
-                <w:color w:val="4A4A4A"/>
-              </w:rPr>
-              <w:t xml:space="preserve">citoyen sénégalais ne soit exclu par la langue. </w:t>
+              <w:t xml:space="preserve">. Pour qu’aucun citoyen sénégalais ne soit exclu par la langue. </w:t>
             </w:r>
             <w:r>
               <w:rPr>
@@ -2345,17 +2097,7 @@
                 <w:sz w:val="26"/>
                 <w:szCs w:val="26"/>
               </w:rPr>
-              <w:t>Au Sénégal, chaque minute peut sauver trois vies. N</w:t>
-            </w:r>
-            <w:r>
-              <w:rPr>
-                <w:b/>
-                <w:bCs/>
-                <w:color w:val="990011"/>
-                <w:sz w:val="26"/>
-                <w:szCs w:val="26"/>
-              </w:rPr>
-              <w:t>ous, nous avons décidé de ne plus en perdre une seule.</w:t>
+              <w:t>Au Sénégal, chaque minute peut sauver trois vies. Nous, nous avons décidé de ne plus en perdre une seule.</w:t>
             </w:r>
           </w:p>
           <w:p>
@@ -2634,15 +2376,7 @@
                 <w:sz w:val="20"/>
                 <w:szCs w:val="20"/>
               </w:rPr>
-              <w:t>_______________Mariama</w:t>
-            </w:r>
-            <w:r>
-              <w:rPr>
-                <w:color w:val="000000"/>
-                <w:sz w:val="20"/>
-                <w:szCs w:val="20"/>
-              </w:rPr>
-              <w:t>_</w:t>
+              <w:t>_______________Mariama_</w:t>
             </w:r>
           </w:p>
         </w:tc>
@@ -2785,15 +2519,7 @@
                 <w:sz w:val="20"/>
                 <w:szCs w:val="20"/>
               </w:rPr>
-              <w:t>_______________Madina</w:t>
-            </w:r>
-            <w:r>
-              <w:rPr>
-                <w:color w:val="000000"/>
-                <w:sz w:val="20"/>
-                <w:szCs w:val="20"/>
-              </w:rPr>
-              <w:t>_</w:t>
+              <w:t>_______________Madina_</w:t>
             </w:r>
           </w:p>
         </w:tc>
@@ -3222,15 +2948,7 @@
                 <w:sz w:val="20"/>
                 <w:szCs w:val="20"/>
               </w:rPr>
-              <w:t>______________</w:t>
-            </w:r>
-            <w:r>
-              <w:rPr>
-                <w:color w:val="000000"/>
-                <w:sz w:val="20"/>
-                <w:szCs w:val="20"/>
-              </w:rPr>
-              <w:t>__Agne</w:t>
+              <w:t>________________Agne</w:t>
             </w:r>
           </w:p>
         </w:tc>
@@ -3400,15 +3118,7 @@
                 <w:sz w:val="20"/>
                 <w:szCs w:val="20"/>
               </w:rPr>
-              <w:t>Roa</w:t>
-            </w:r>
-            <w:r>
-              <w:rPr>
-                <w:color w:val="000000"/>
-                <w:sz w:val="20"/>
-                <w:szCs w:val="20"/>
-              </w:rPr>
-              <w:t>dmap + conclusion</w:t>
+              <w:t>Roadmap + conclusion</w:t>
             </w:r>
           </w:p>
         </w:tc>
@@ -3498,41 +3208,27 @@
           <w:i/>
           <w:iCs/>
         </w:rPr>
-        <w:t>Système médical = rigueur non négociable. Le Cycle en V garantit la traçabilité demandée par le CNTS. Mais on a besoin de feedback terrain rapide, donc on fait des itérations Scrum de 2 semaines à l’</w:t>
-      </w:r>
+        <w:t>Système médical = rigueur non négociable. Le Cycle en V garantit la traçabilité demandée par le CNTS. Mais on a besoin de feedback terrain rapide, donc on fait des itérations Scrum de 2 semaines à l’intérieur de chaque phase. C’est le meilleur des deux mondes.</w:t>
+      </w:r>
+    </w:p>
+    <w:p>
+      <w:pPr>
+        <w:pStyle w:val="Titre3"/>
+      </w:pPr>
+      <w:r>
+        <w:t>« Comment vous protégez les données médicales ? »</w:t>
+      </w:r>
+    </w:p>
+    <w:p>
+      <w:pPr>
+        <w:spacing w:after="120"/>
+      </w:pPr>
       <w:r>
         <w:rPr>
           <w:i/>
           <w:iCs/>
         </w:rPr>
-        <w:t>intérieur de chaque phase. C’est le meilleur des deux mondes.</w:t>
-      </w:r>
-    </w:p>
-    <w:p>
-      <w:pPr>
-        <w:pStyle w:val="Titre3"/>
-      </w:pPr>
-      <w:r>
-        <w:t>« Comment vous protégez les données médicales ? »</w:t>
-      </w:r>
-    </w:p>
-    <w:p>
-      <w:pPr>
-        <w:spacing w:after="120"/>
-      </w:pPr>
-      <w:r>
-        <w:rPr>
-          <w:i/>
-          <w:iCs/>
-        </w:rPr>
-        <w:t>Trois lignes de défense : (1) JWT + bcrypt + rate-limit anti brute-force, (2) validation Zod sur toutes les entrées, (3) audit log complet de to</w:t>
-      </w:r>
-      <w:r>
-        <w:rPr>
-          <w:i/>
-          <w:iCs/>
-        </w:rPr>
-        <w:t>utes les actions sensibles. L’IA elle-même est encadrée par un garde SQL qui n’autorise que les SELECT.</w:t>
+        <w:t>Défense en profondeur : (1) JWT + bcrypt + rate-limit anti brute-force, (2) validation Zod de toutes les entrées, (3) cloisonnement strict par rôle — un hôpital ne voit que ses données, vérifié par 61 tests automatisés, (4) audit log de toute action sensible, (5) droits RGPD codés : export, anonymisation, droit à l’oubli (Loi 2008-12). L’IA est encadrée par un garde SQL qui n’autorise que les SELECT.</w:t>
       </w:r>
     </w:p>
     <w:p>
@@ -3572,14 +3268,27 @@
           <w:i/>
           <w:iCs/>
         </w:rPr>
-        <w:t>Nous av</w:t>
-      </w:r>
+        <w:t>Nous avons rencontré M. Serigne Kote, qui a accepté d’évaluer l’application après dépôt d’une demande officielle de collaboration. C’est notre prochaine étape concrète.</w:t>
+      </w:r>
+    </w:p>
+    <w:p>
+      <w:pPr>
+        <w:pStyle w:val="Titre3"/>
+      </w:pPr>
+      <w:r>
+        <w:t>« Pourquoi Groq et pas OpenAI ? »</w:t>
+      </w:r>
+    </w:p>
+    <w:p>
+      <w:pPr>
+        <w:spacing w:after="120"/>
+      </w:pPr>
       <w:r>
         <w:rPr>
           <w:i/>
           <w:iCs/>
         </w:rPr>
-        <w:t>ons rencontré M. Serigne Kote, qui a accepté d’évaluer l’application après dépôt d’une demande officielle de collaboration. C’est notre prochaine étape concrète.</w:t>
+        <w:t>Latence inférieure à 1 seconde, gratuit pour usage modéré, et Llama 3.3 70B est comparable à GPT-4 sur le français. Sur un système d’urgence, la latence compte.</w:t>
       </w:r>
     </w:p>
     <w:p>
@@ -3587,7 +3296,7 @@
         <w:pStyle w:val="Titre3"/>
       </w:pPr>
       <w:r>
-        <w:t>« Pourquoi Groq et pas OpenAI ? »</w:t>
+        <w:t>« Que se passe-t-il si aucun donneur ne répond ? »</w:t>
       </w:r>
     </w:p>
     <w:p>
@@ -3599,41 +3308,7 @@
           <w:i/>
           <w:iCs/>
         </w:rPr>
-        <w:t>Latence inférieure à 1 seconde, gratuit pour usage modéré, e</w:t>
-      </w:r>
-      <w:r>
-        <w:rPr>
-          <w:i/>
-          <w:iCs/>
-        </w:rPr>
-        <w:t>t Llama 3.3 70B est comparable à GPT-4 sur le français. Sur un système d’urgence, la latence compte.</w:t>
-      </w:r>
-    </w:p>
-    <w:p>
-      <w:pPr>
-        <w:pStyle w:val="Titre3"/>
-      </w:pPr>
-      <w:r>
-        <w:t>« Que se passe-t-il si aucun donneur ne répond ? »</w:t>
-      </w:r>
-    </w:p>
-    <w:p>
-      <w:pPr>
-        <w:spacing w:after="120"/>
-      </w:pPr>
-      <w:r>
-        <w:rPr>
-          <w:i/>
-          <w:iCs/>
-        </w:rPr>
-        <w:t xml:space="preserve">L’alerte reste « en cours », et le staff hôpital peut l’étendre manuellement à un rayon plus large ou à </w:t>
-      </w:r>
-      <w:r>
-        <w:rPr>
-          <w:i/>
-          <w:iCs/>
-        </w:rPr>
-        <w:t>un groupe sanguin secondaire compatible. À terme, l’IA prédictive proposera automatiquement la meilleure action de relance.</w:t>
+        <w:t>L’alerte reste « en cours », et le staff hôpital peut l’étendre manuellement à un rayon plus large ou à un groupe sanguin secondaire compatible. À terme, l’IA prédictive proposera automatiquement la meilleure action de relance.</w:t>
       </w:r>
     </w:p>
     <w:p>
@@ -3690,10 +3365,7 @@
         </w:numPr>
       </w:pPr>
       <w:r>
-        <w:t>Sur les slides : minimum de texte, maximum de visuel. Cap</w:t>
-      </w:r>
-      <w:r>
-        <w:t>tures HemoLink, MCD, schémas.</w:t>
+        <w:t>Sur les slides : minimum de texte, maximum de visuel. Captures HemoLink, MCD, schémas.</w:t>
       </w:r>
     </w:p>
     <w:p>
@@ -3749,10 +3421,7 @@
         </w:numPr>
       </w:pPr>
       <w:r>
-        <w:t xml:space="preserve">Pointez </w:t>
-      </w:r>
-      <w:r>
-        <w:t>l’écran quand vous montrez une fonctionnalité — guidez le regard du jury.</w:t>
+        <w:t>Pointez l’écran quand vous montrez une fonctionnalité — guidez le regard du jury.</w:t>
       </w:r>
     </w:p>
     <w:p>
@@ -3796,10 +3465,7 @@
         </w:numPr>
       </w:pPr>
       <w:r>
-        <w:t>Intervena</w:t>
-      </w:r>
-      <w:r>
-        <w:t>nt 1 → 2 : "Mais avant tout, il faut comprendre comment ça marche."</w:t>
+        <w:t>Intervenant 1 → 2 : "Mais avant tout, il faut comprendre comment ça marche."</w:t>
       </w:r>
     </w:p>
     <w:p>
@@ -3847,10 +3513,7 @@
         </w:numPr>
       </w:pPr>
       <w:r>
-        <w:t>Intervenant 5 → 6 :</w:t>
-      </w:r>
-      <w:r>
-        <w:t xml:space="preserve"> "La donnée médicale accessible à tous."</w:t>
+        <w:t>Intervenant 5 → 6 : "La donnée médicale accessible à tous."</w:t>
       </w:r>
     </w:p>
     <w:sectPr>

</xml_diff>